<commit_message>
added enemy hp bar
</commit_message>
<xml_diff>
--- a/Slash RPG Game Design Document.docx
+++ b/Slash RPG Game Design Document.docx
@@ -21,17 +21,36 @@
     </w:p>
     <w:p/>
     <w:p>
-      <w:r>
+      <w:pPr>
+        <w:rPr>
+          <w:strike/>
+        </w:rPr>
+      </w:pPr>
+      <w:r>
+        <w:rPr>
+          <w:strike/>
+        </w:rPr>
         <w:t>Weighty combat with momentum</w:t>
       </w:r>
     </w:p>
     <w:p>
       <w:r>
+        <w:t xml:space="preserve">! </w:t>
+      </w:r>
+      <w:r>
         <w:t>Puzzle solving</w:t>
       </w:r>
     </w:p>
     <w:p>
-      <w:r>
+      <w:pPr>
+        <w:rPr>
+          <w:strike/>
+        </w:rPr>
+      </w:pPr>
+      <w:r>
+        <w:rPr>
+          <w:strike/>
+        </w:rPr>
         <w:t>Fun movement</w:t>
       </w:r>
     </w:p>
@@ -57,7 +76,47 @@
       <w:r>
         <w:t xml:space="preserve"> or hades bosses</w:t>
       </w:r>
+      <w:r>
+        <w:t xml:space="preserve">. </w:t>
+      </w:r>
     </w:p>
+    <w:p/>
+    <w:p>
+      <w:r>
+        <w:t>Bringing together Chalice dungeon (no time limit, explore dungeon, enemies+boss),</w:t>
+      </w:r>
+      <w:r>
+        <w:t xml:space="preserve"> PoE/Lost Ark mechanics and satisfying AoE abilities not one enemy at a time. </w:t>
+      </w:r>
+    </w:p>
+    <w:p/>
+    <w:p>
+      <w:r>
+        <w:t>No voiced dialogue, just text boxes like</w:t>
+      </w:r>
+      <w:r>
+        <w:t xml:space="preserve"> old</w:t>
+      </w:r>
+      <w:r>
+        <w:t xml:space="preserve"> FF games, Zelda etc.</w:t>
+      </w:r>
+    </w:p>
+    <w:p/>
+    <w:p>
+      <w:r>
+        <w:t>Lore</w:t>
+      </w:r>
+      <w:r>
+        <w:br/>
+      </w:r>
+      <w:r>
+        <w:br/>
+        <w:t xml:space="preserve">Player character is searching for someone. They go through endless dungeons, hordes of monsters, on a journey to find the person they are searching for. </w:t>
+      </w:r>
+    </w:p>
+    <w:p/>
+    <w:p/>
+    <w:p/>
     <w:p/>
     <w:p/>
     <w:sectPr>

</xml_diff>